<commit_message>
Update educational qualifications in index.html and replace resume with updated version
</commit_message>
<xml_diff>
--- a/assets/docs/Tim_Zhang_Resume.docx
+++ b/assets/docs/Tim_Zhang_Resume.docx
@@ -125,8 +125,6 @@
         </w:rPr>
         <w:t>PROFESSIONAL SUMMARY</w:t>
       </w:r>
-      <w:bookmarkStart w:id="0" w:name="_GoBack"/>
-      <w:bookmarkEnd w:id="0"/>
     </w:p>
     <w:p>
       <w:r>
@@ -1036,7 +1034,16 @@
           <w:rFonts w:hint="default"/>
           <w:lang w:val="en-US"/>
         </w:rPr>
-        <w:t xml:space="preserve"> and BusinessAnalytics</w:t>
+        <w:t xml:space="preserve"> and Business </w:t>
+      </w:r>
+      <w:bookmarkStart w:id="0" w:name="_GoBack"/>
+      <w:bookmarkEnd w:id="0"/>
+      <w:r>
+        <w:rPr>
+          <w:rFonts w:hint="default"/>
+          <w:lang w:val="en-US"/>
+        </w:rPr>
+        <w:t>Analytics</w:t>
       </w:r>
     </w:p>
     <w:p>

</xml_diff>

<commit_message>
Revise index.html for improved title and description, enhance hero section text, and update resume document. Adjust CSS for hero styling consistency.
</commit_message>
<xml_diff>
--- a/assets/docs/Tim_Zhang_Resume.docx
+++ b/assets/docs/Tim_Zhang_Resume.docx
@@ -417,13 +417,12 @@
           <w:b/>
           <w:sz w:val="18"/>
         </w:rPr>
-        <w:t xml:space="preserve">Results: </w:t>
+        <w:t>Results: 67 commits, 80,430 lines of code across two iterations | 12/12 requirements fully implemented | End-to-end automation achieved | Reduced processing time by 75% (40 min → 10 min) | Projected annual cost savings of HK$6.39M</w:t>
       </w:r>
       <w:r>
         <w:rPr>
           <w:sz w:val="18"/>
         </w:rPr>
-        <w:t>67 commits, 80,430 lines of code across two iterations | 12/12 requirements fully implemented | End-to-end automation achieved</w:t>
       </w:r>
     </w:p>
     <w:p>
@@ -571,13 +570,12 @@
           <w:b/>
           <w:sz w:val="18"/>
         </w:rPr>
-        <w:t xml:space="preserve">Results: </w:t>
+        <w:t>Results: 4 GitHub stars, 37 commits, 86.3% Python codebase | Production-ready deployment | Policy Q&amp;A accuracy &gt;95% | Average retrieval time reduced by &gt;70%</w:t>
       </w:r>
       <w:r>
         <w:rPr>
           <w:sz w:val="18"/>
         </w:rPr>
-        <w:t>4 GitHub stars, 37 commits, 86.3% Python codebase | Production-ready deployment</w:t>
       </w:r>
     </w:p>
     <w:p>
@@ -609,6 +607,66 @@
           <w:sz w:val="24"/>
         </w:rPr>
         <w:t>PROFESSIONAL EXPERIENCE</w:t>
+      </w:r>
+    </w:p>
+    <w:p>
+      <w:pPr>
+        <w:rPr>
+          <w:rFonts w:hint="default"/>
+          <w:lang w:val="en-US"/>
+        </w:rPr>
+      </w:pPr>
+      <w:r>
+        <w:rPr>
+          <w:b/>
+          <w:sz w:val="20"/>
+        </w:rPr>
+        <w:t xml:space="preserve">AI Engineer / System Architect (Part-time) | Lingnan University — SRR &amp; RAGagent Projects | 09/2025 - Present</w:t>
+      </w:r>
+    </w:p>
+    <w:p>
+      <w:pPr>
+        <w:rPr>
+          <w:rFonts w:hint="default"/>
+          <w:lang w:val="en-US"/>
+        </w:rPr>
+      </w:pPr>
+      <w:r>
+        <w:rPr>
+          <w:b/>
+          <w:sz w:val="20"/>
+        </w:rPr>
+        <w:t xml:space="preserve">• Designed and built a 7-layer Agentic architecture with 17 pluggable capabilities for HK ArchSD case processing, delivering 67 commits and 80,430 lines of code with end-to-end automation</w:t>
+      </w:r>
+    </w:p>
+    <w:p>
+      <w:pPr>
+        <w:rPr>
+          <w:rFonts w:hint="default"/>
+          <w:lang w:val="en-US"/>
+        </w:rPr>
+      </w:pPr>
+      <w:r>
+        <w:rPr>
+          <w:b/>
+          <w:sz w:val="20"/>
+        </w:rPr>
+        <w:t xml:space="preserve">• Built RAGagent university policy Q&amp;A system with pgvector + Vertex AI (Gemini), achieving &gt;95% policy Q&amp;A accuracy</w:t>
+      </w:r>
+    </w:p>
+    <w:p>
+      <w:pPr>
+        <w:rPr>
+          <w:rFonts w:hint="default"/>
+          <w:lang w:val="en-US"/>
+        </w:rPr>
+      </w:pPr>
+      <w:r>
+        <w:rPr>
+          <w:b/>
+          <w:sz w:val="20"/>
+        </w:rPr>
+        <w:t xml:space="preserve">• Deployed containerized AI services on GCP Cloud Run with PostgreSQL + pgvector for semantic retrieval</w:t>
       </w:r>
     </w:p>
     <w:p>

</xml_diff>

<commit_message>
Update portfolio enterprise and Uniflo content
</commit_message>
<xml_diff>
--- a/assets/docs/Tim_Zhang_Resume.docx
+++ b/assets/docs/Tim_Zhang_Resume.docx
@@ -52,8 +52,37 @@
           <w:color w:val="585854"/>
           <w:sz w:val="16"/>
         </w:rPr>
-        <w:t>Portfolio: tim-portfolio.github.io/tim-portfolio | GitHub: github.com/February13</w:t>
+        <w:t xml:space="preserve">Portfolio: </w:t>
       </w:r>
+      <w:hyperlink r:id="rId9">
+        <w:r>
+          <w:rPr>
+            <w:color w:val="B45534"/>
+            <w:u w:val="single"/>
+            <w:sz w:val="16"/>
+            <w:szCs w:val="16"/>
+          </w:rPr>
+          <w:t>portfolio.timzhang.cn</w:t>
+        </w:r>
+      </w:hyperlink>
+      <w:r>
+        <w:rPr>
+          <w:color w:val="585854"/>
+          <w:sz w:val="16"/>
+        </w:rPr>
+        <w:t xml:space="preserve"> | GitHub: </w:t>
+      </w:r>
+      <w:hyperlink r:id="rId10">
+        <w:r>
+          <w:rPr>
+            <w:color w:val="B45534"/>
+            <w:u w:val="single"/>
+            <w:sz w:val="16"/>
+            <w:szCs w:val="16"/>
+          </w:rPr>
+          <w:t>github.com/February13</w:t>
+        </w:r>
+      </w:hyperlink>
     </w:p>
     <w:p>
       <w:pPr>
@@ -79,194 +108,7 @@
         <w:rPr>
           <w:sz w:val="17"/>
         </w:rPr>
-        <w:t>Data Engineer and AI-driven pipeline architect with 8+ years of production data engineering experience across commercial banking, multinational retail, cloud data warehouses, GovTech automation, insurance FWA, and clinical AI. Delivered 10TB+ cloud migration, five-layer warehouse architecture, SOX-aware financial data workflows, StarRocks performance optimization, and production reporting pipelines before moving into Agentic RAG, GraphDB, and clinical AI systems. Recent flagship work includes the award-winning SRR Agentic Case Processing System, GaitGPT clinical gait analysis agent, and MCC FWA insurance fraud graph intelligence system.</w:t>
-      </w:r>
-    </w:p>
-    <w:p>
-      <w:pPr>
-        <w:spacing w:before="80" w:after="40"/>
-        <w:pBdr>
-          <w:bottom w:val="single" w:sz="8" w:space="1" w:color="B45534"/>
-        </w:pBdr>
-      </w:pPr>
-      <w:r>
-        <w:rPr>
-          <w:b/>
-          <w:color w:val="1F374F"/>
-          <w:sz w:val="19"/>
-        </w:rPr>
-        <w:t>PUBLICATIONS, PATENTS &amp; AWARDS</w:t>
-      </w:r>
-    </w:p>
-    <w:p>
-      <w:pPr>
-        <w:spacing w:after="20" w:line="240" w:lineRule="auto"/>
-      </w:pPr>
-      <w:r>
-        <w:rPr>
-          <w:b/>
-          <w:color w:val="141413"/>
-          <w:sz w:val="16"/>
-        </w:rPr>
-        <w:t xml:space="preserve">Zhang, W. (manuscript in preparation). </w:t>
-      </w:r>
-      <w:r>
-        <w:rPr>
-          <w:color w:val="141413"/>
-          <w:sz w:val="16"/>
-        </w:rPr>
-        <w:t>From Symptoms to Signals: A Bidirectional LLM Framework for Literature-Grounded Clinical Gait Analysis.</w:t>
-      </w:r>
-    </w:p>
-    <w:p>
-      <w:pPr>
-        <w:spacing w:after="20" w:line="240" w:lineRule="auto"/>
-      </w:pPr>
-      <w:r>
-        <w:rPr>
-          <w:b/>
-          <w:color w:val="141413"/>
-          <w:sz w:val="16"/>
-        </w:rPr>
-        <w:t xml:space="preserve">Zhang, W. (patent disclosure in preparation). </w:t>
-      </w:r>
-      <w:r>
-        <w:rPr>
-          <w:color w:val="141413"/>
-          <w:sz w:val="16"/>
-        </w:rPr>
-        <w:t>File-Driven Intelligent Case Processing System and Method for Public-Service Complaint Workflows / 一种面向公共服务投诉流程的文件驱动智能案件处理系统及方法.</w:t>
-      </w:r>
-    </w:p>
-    <w:p>
-      <w:pPr>
-        <w:spacing w:after="20" w:line="240" w:lineRule="auto"/>
-      </w:pPr>
-      <w:r>
-        <w:rPr>
-          <w:b/>
-          <w:color w:val="141413"/>
-          <w:sz w:val="16"/>
-        </w:rPr>
-        <w:t xml:space="preserve">Zhang, W. (invention disclosure in preparation). </w:t>
-      </w:r>
-      <w:r>
-        <w:rPr>
-          <w:color w:val="141413"/>
-          <w:sz w:val="16"/>
-        </w:rPr>
-        <w:t>Evidence-Bound Bidirectional Clinical Gait Translation System and Method.</w:t>
-      </w:r>
-    </w:p>
-    <w:p>
-      <w:pPr>
-        <w:spacing w:after="20" w:line="240" w:lineRule="auto"/>
-      </w:pPr>
-      <w:r>
-        <w:rPr>
-          <w:b/>
-          <w:color w:val="141413"/>
-          <w:sz w:val="16"/>
-        </w:rPr>
-        <w:t xml:space="preserve">Zhang, W. (patent disclosure in preparation). </w:t>
-      </w:r>
-      <w:r>
-        <w:rPr>
-          <w:color w:val="141413"/>
-          <w:sz w:val="16"/>
-        </w:rPr>
-        <w:t>Vision-Link Discovery: Multi-Model Fusion Method for Cross-Modal Visual Relationship Discovery.</w:t>
-      </w:r>
-    </w:p>
-    <w:p>
-      <w:pPr>
-        <w:spacing w:after="20" w:line="240" w:lineRule="auto"/>
-      </w:pPr>
-      <w:r>
-        <w:rPr>
-          <w:b/>
-          <w:color w:val="141413"/>
-          <w:sz w:val="16"/>
-        </w:rPr>
-        <w:t xml:space="preserve">Lingnan Cup Second Prize. </w:t>
-      </w:r>
-      <w:r>
-        <w:rPr>
-          <w:color w:val="141413"/>
-          <w:sz w:val="16"/>
-        </w:rPr>
-        <w:t>4th Sun Yat-sen University Lingnan Cup China Economic Development Case Competition; HK Lingnan University MScAIBA team SRR case selected from 163 teams, with 8 finalists.</w:t>
-      </w:r>
-    </w:p>
-    <w:p>
-      <w:pPr>
-        <w:spacing w:before="80" w:after="40"/>
-        <w:pBdr>
-          <w:bottom w:val="single" w:sz="8" w:space="1" w:color="B45534"/>
-        </w:pBdr>
-      </w:pPr>
-      <w:r>
-        <w:rPr>
-          <w:b/>
-          <w:color w:val="1F374F"/>
-          <w:sz w:val="19"/>
-        </w:rPr>
-        <w:t>EDUCATION &amp; AIBA COURSEWORK</w:t>
-      </w:r>
-    </w:p>
-    <w:p>
-      <w:pPr>
-        <w:spacing w:after="0"/>
-      </w:pPr>
-      <w:r>
-        <w:rPr>
-          <w:b/>
-          <w:color w:val="141413"/>
-          <w:sz w:val="16"/>
-        </w:rPr>
-        <w:t>MSc in Artificial Intelligence and Business Analytics</w:t>
-      </w:r>
-      <w:r>
-        <w:rPr>
-          <w:color w:val="141413"/>
-          <w:sz w:val="16"/>
-        </w:rPr>
-        <w:t xml:space="preserve"> | Lingnan University, Hong Kong | 2025 - 2026</w:t>
-      </w:r>
-    </w:p>
-    <w:p>
-      <w:pPr>
-        <w:pStyle w:val="ListBullet"/>
-        <w:spacing w:after="8" w:line="245" w:lineRule="auto"/>
-        <w:ind w:left="259" w:hanging="173"/>
-      </w:pPr>
-      <w:r>
-        <w:rPr>
-          <w:rFonts w:ascii="Arial" w:hAnsi="Arial"/>
-          <w:color w:val="141413"/>
-          <w:sz w:val="16"/>
-        </w:rPr>
-        <w:t>Relevant AIBA coursework: Foundation of Artificial Intelligence; Business Data Management; Principle of Data Analytics and Programming; Blockchain; Healthcare Analytics; Data Visualization; Programming with Generative AI; AI-Based Optimization.</w:t>
-      </w:r>
-    </w:p>
-    <w:p>
-      <w:pPr>
-        <w:spacing w:after="0"/>
-      </w:pPr>
-      <w:r>
-        <w:rPr>
-          <w:b/>
-          <w:color w:val="141413"/>
-          <w:sz w:val="16"/>
-        </w:rPr>
-        <w:t>Bachelor of Management</w:t>
-      </w:r>
-      <w:r>
-        <w:rPr>
-          <w:color w:val="141413"/>
-          <w:sz w:val="16"/>
-        </w:rPr>
-        <w:t xml:space="preserve"> | Shenzhen University, China | 2014 - 2017</w:t>
+        <w:t>Data Engineer and AI-driven pipeline architect with 8+ years of production data engineering experience across commercial banking, multinational retail, cloud data warehouses, GovTech automation, insurance FWA, and research AI. Delivered 10TB+ cloud migration, five-layer warehouse architecture, SOX-aware financial data workflows, StarRocks performance optimization, and production reporting pipelines before moving into Agentic RAG, Agent Runtime, GraphDB, and research AI systems. Recent flagship work includes the award-winning SRR Agentic Case Processing System, Uniflo software-hardware multi-end intelligent continuous delivery platform, MCC FWA insurance fraud graph intelligence system, and GaitGPT privacy-first gait research assistant.</w:t>
       </w:r>
     </w:p>
     <w:p>
@@ -342,7 +184,7 @@
           <w:color w:val="141413"/>
           <w:sz w:val="16"/>
         </w:rPr>
-        <w:t>FastAPI, LangChain/LangGraph, RAG, Agentic workflows, pgvector, GraphDB/Neo4j, OpenAI GPT-4o, Gemini, LLM-as-Judge</w:t>
+        <w:t>FastAPI, LangChain/LangGraph, RAG, Agentic workflows, Agent Runtime, multi-end delivery, workspace permissions, workflow trace, pgvector, GraphDB/Neo4j, OpenAI GPT-4o, Gemini, LLM-as-Judge</w:t>
       </w:r>
     </w:p>
     <w:p>
@@ -362,7 +204,7 @@
           <w:color w:val="141413"/>
           <w:sz w:val="16"/>
         </w:rPr>
-        <w:t>Banking data models, B2B order/contract/P&amp;L reporting, claims adjudication, SOX-aware data workflows</w:t>
+        <w:t>Commercial-bank credit/limit/lending models, retail PNL/B2B/HR/Leasing reporting, claims adjudication, SOX-aware data workflows</w:t>
       </w:r>
     </w:p>
     <w:p>
@@ -435,7 +277,7 @@
         </w:rPr>
         <w:t xml:space="preserve">Project links: </w:t>
       </w:r>
-      <w:hyperlink r:id="rId9">
+      <w:hyperlink r:id="rId11">
         <w:r>
           <w:rPr>
             <w:color w:val="B45534"/>
@@ -453,7 +295,7 @@
         </w:rPr>
         <w:t xml:space="preserve">  |  </w:t>
       </w:r>
-      <w:hyperlink r:id="rId10">
+      <w:hyperlink r:id="rId12">
         <w:r>
           <w:rPr>
             <w:color w:val="B45534"/>
@@ -539,7 +381,7 @@
           <w:color w:val="141413"/>
           <w:sz w:val="17"/>
         </w:rPr>
-        <w:t>GaitGPT: Literature-Augmented Clinical Gait Analysis Agent</w:t>
+        <w:t>Uniflo: Multi-End AI Continuous Delivery Platform</w:t>
       </w:r>
       <w:r>
         <w:rPr>
@@ -547,7 +389,7 @@
           <w:color w:val="585854"/>
           <w:sz w:val="16"/>
         </w:rPr>
-        <w:t xml:space="preserve"> | Architecture Lead | Manuscript in preparation | iCAN 2026 | LU invention disclosure | 2026</w:t>
+        <w:t xml:space="preserve"> | Core Builder | Product &amp; Runtime Architecture | Software-hardware multi-end delivery | 2026</w:t>
       </w:r>
     </w:p>
     <w:p>
@@ -563,7 +405,7 @@
         </w:rPr>
         <w:t xml:space="preserve">Project links: </w:t>
       </w:r>
-      <w:hyperlink r:id="rId11">
+      <w:hyperlink r:id="rId13">
         <w:r>
           <w:rPr>
             <w:color w:val="B45534"/>
@@ -581,7 +423,7 @@
         </w:rPr>
         <w:t xml:space="preserve">  |  </w:t>
       </w:r>
-      <w:hyperlink r:id="rId12">
+      <w:hyperlink r:id="rId14">
         <w:r>
           <w:rPr>
             <w:color w:val="B45534"/>
@@ -589,7 +431,7 @@
             <w:sz w:val="16"/>
             <w:szCs w:val="16"/>
           </w:rPr>
-          <w:t>Public showcase repo</w:t>
+          <w:t>OpenUniflo repo</w:t>
         </w:r>
       </w:hyperlink>
     </w:p>
@@ -605,7 +447,7 @@
           <w:color w:val="141413"/>
           <w:sz w:val="16"/>
         </w:rPr>
-        <w:t>Situation/Task: Gait datasets produce dense sensor indicators, while clinicians reason in symptom terms such as limping, shuffling gait, and asymmetry.</w:t>
+        <w:t>Situation/Task: Fragmented files, meetings, chats, device-facing capture inputs, and tool calls need persistent context, safe access, and repeatable delivery across software and hardware-facing surfaces beyond one-off chat.</w:t>
       </w:r>
     </w:p>
     <w:p>
@@ -620,7 +462,7 @@
           <w:color w:val="141413"/>
           <w:sz w:val="16"/>
         </w:rPr>
-        <w:t>Action: Led system direction and architecture; implemented reverse translation, knowledge explanation, PubMed/Semantic Scholar retrieval, evidence scoring, rule-template-first queries, and physics-constrained validation.</w:t>
+        <w:t>Action: Built across the Python runtime, React Web UI, OpenAI-compatible API, skill system, workspace and capture-aware access boundaries, permission guards, trace events, and Application candidate lifecycle.</w:t>
       </w:r>
     </w:p>
     <w:p>
@@ -635,7 +477,7 @@
           <w:color w:val="141413"/>
           <w:sz w:val="16"/>
         </w:rPr>
-        <w:t>Result: Evaluated on a 20-question NONSD-Gait benchmark with 0.9223 overall accuracy and 10.07s median response time; prepared manuscript "From Symptoms to Signals" plus iCAN 2026 and LU invention-disclosure materials.</w:t>
+        <w:t>Result: Turned UniFlo from product thesis into an evolving platform codebase and evidence-backed portfolio story, with patent-prep directions around FileKG, Vision-Link Discovery, multi-end capture, and traceable source-reference mechanisms.</w:t>
       </w:r>
     </w:p>
     <w:p>
@@ -654,7 +496,7 @@
           <w:color w:val="585854"/>
           <w:sz w:val="16"/>
         </w:rPr>
-        <w:t>Python, FastAPI, Next.js/React, SurrealDB, LangGraph, PubMed/Semantic Scholar APIs, Ollama/Qwen, OpenAI-compatible providers</w:t>
+        <w:t>Python, FastAPI/aiohttp, React/Vite, OpenAI-compatible API, multi-end workflow orchestration, workspace tools, skill runtime, trace store, permission policy</w:t>
       </w:r>
     </w:p>
     <w:p>
@@ -743,8 +585,113 @@
       </w:r>
     </w:p>
     <w:p>
+      <w:pPr>
+        <w:spacing w:before="40" w:after="0"/>
+      </w:pPr>
       <w:r>
-        <w:br w:type="page"/>
+        <w:rPr>
+          <w:b/>
+          <w:color w:val="141413"/>
+          <w:sz w:val="17"/>
+        </w:rPr>
+        <w:t>GaitGPT: Privacy-First Clinical Gait Research Assistant</w:t>
+      </w:r>
+      <w:r>
+        <w:rPr>
+          <w:i/>
+          <w:color w:val="585854"/>
+          <w:sz w:val="16"/>
+        </w:rPr>
+        <w:t xml:space="preserve"> | Architecture Lead | Manuscript in preparation | iCAN 2026 | University IP materials in process | 2026</w:t>
+      </w:r>
+    </w:p>
+    <w:p>
+      <w:pPr>
+        <w:spacing w:after="0"/>
+        <w:ind w:left="58"/>
+      </w:pPr>
+      <w:r>
+        <w:rPr>
+          <w:b/>
+          <w:color w:val="B45534"/>
+          <w:sz w:val="16"/>
+        </w:rPr>
+        <w:t xml:space="preserve">Project links: </w:t>
+      </w:r>
+      <w:hyperlink r:id="rId15">
+        <w:r>
+          <w:rPr>
+            <w:color w:val="B45534"/>
+            <w:u w:val="single"/>
+            <w:sz w:val="16"/>
+            <w:szCs w:val="16"/>
+          </w:rPr>
+          <w:t>Portfolio case study</w:t>
+        </w:r>
+      </w:hyperlink>
+    </w:p>
+    <w:p>
+      <w:pPr>
+        <w:pStyle w:val="ListBullet"/>
+        <w:spacing w:after="8" w:line="245" w:lineRule="auto"/>
+        <w:ind w:left="259" w:hanging="173"/>
+      </w:pPr>
+      <w:r>
+        <w:rPr>
+          <w:rFonts w:ascii="Arial" w:hAnsi="Arial"/>
+          <w:color w:val="141413"/>
+          <w:sz w:val="16"/>
+        </w:rPr>
+        <w:t>Situation/Task: Gait datasets produce dense sensor indicators, while clinicians reason in symptom terms such as limping, shuffling gait, and asymmetry.</w:t>
+      </w:r>
+    </w:p>
+    <w:p>
+      <w:pPr>
+        <w:pStyle w:val="ListBullet"/>
+        <w:spacing w:after="8" w:line="245" w:lineRule="auto"/>
+        <w:ind w:left="259" w:hanging="173"/>
+      </w:pPr>
+      <w:r>
+        <w:rPr>
+          <w:rFonts w:ascii="Arial" w:hAnsi="Arial"/>
+          <w:color w:val="141413"/>
+          <w:sz w:val="16"/>
+        </w:rPr>
+        <w:t>Action: Led system direction and architecture; implemented intent routing, rule-first CSV analysis, literature-enhanced explanation, structured Findings output, and biomechanics-aware validation.</w:t>
+      </w:r>
+    </w:p>
+    <w:p>
+      <w:pPr>
+        <w:pStyle w:val="ListBullet"/>
+        <w:spacing w:after="8" w:line="245" w:lineRule="auto"/>
+        <w:ind w:left="259" w:hanging="173"/>
+      </w:pPr>
+      <w:r>
+        <w:rPr>
+          <w:rFonts w:ascii="Arial" w:hAnsi="Arial"/>
+          <w:color w:val="141413"/>
+          <w:sz w:val="16"/>
+        </w:rPr>
+        <w:t>Result: Evaluated on a 20-question NONSD-Gait benchmark with 0.9223 overall accuracy and 10.07s median response time; prepared manuscript, iCAN 2026 package, and university IP materials while keeping patent-sensitive implementation details private.</w:t>
+      </w:r>
+    </w:p>
+    <w:p>
+      <w:pPr>
+        <w:spacing w:after="20"/>
+      </w:pPr>
+      <w:r>
+        <w:rPr>
+          <w:b/>
+          <w:sz w:val="16"/>
+        </w:rPr>
+        <w:t xml:space="preserve">Tech: </w:t>
+      </w:r>
+      <w:r>
+        <w:rPr>
+          <w:color w:val="585854"/>
+          <w:sz w:val="16"/>
+        </w:rPr>
+        <w:t>Python, FastAPI, Next.js/React, SurrealDB, LangGraph, PubMed/Semantic Scholar APIs, Ollama/Qwen, OpenAI-compatible providers</w:t>
       </w:r>
     </w:p>
     <w:p>
@@ -794,7 +741,7 @@
           <w:color w:val="141413"/>
           <w:sz w:val="16"/>
         </w:rPr>
-        <w:t>Situation/Task: B2B finance and operations reporting for a multinational retail enterprise depended on fragmented order, contract, billing, inventory, gift-card, warehouse, and finance sources.</w:t>
+        <w:t>Situation/Task: Retail finance and operations reporting for a multinational enterprise covered PNL, B2B, HR, Leasing, order, contract, billing, inventory, gift-card, warehouse, and finance sources.</w:t>
       </w:r>
     </w:p>
     <w:p>
@@ -809,7 +756,7 @@
           <w:color w:val="141413"/>
           <w:sz w:val="16"/>
         </w:rPr>
-        <w:t>Action: Migrated 10TB+ IDC warehouse workloads to Tencent Cloud, rebuilt ODS/DIM/DWD/DWS/ADS layers, and delivered report-ready ADS tables across project, order, item, customer, store, fulfillment, inventory, margin, payment, approval, and ETL-load fields.</w:t>
+        <w:t>Action: Migrated 10TB+ IDC warehouse workloads to Tencent Cloud, rebuilt ODS/DIM/DWD/DWS/ADS layers, supported B2B refined management, mapped data assets and lineage, and added T+0 data quality response plus production monitoring.</w:t>
       </w:r>
     </w:p>
     <w:p>
@@ -824,7 +771,7 @@
           <w:color w:val="141413"/>
           <w:sz w:val="16"/>
         </w:rPr>
-        <w:t>Result: Seatunnel sync reached 99.95% consistency and cut failures by 70%; ORC/SparkSQL optimization reduced disk by 38%, improved query speed by 55%, cut ETL runtime by 87.5%, and StarRocks + Hive external table acceleration moved core analytical queries from 3-10 minutes to avg. 0.8s.</w:t>
+        <w:t>Result: Improved the finance data foundation by 50%+; Seatunnel sync reached 99.95% consistency and cut failures by 70%; ORC/SparkSQL optimization reduced disk by 38%, improved query speed by 55%, cut ETL runtime by 87.5%, and StarRocks materialized-view / model optimization moved core analytical queries from 3-10 minutes to avg. 0.8s.</w:t>
       </w:r>
     </w:p>
     <w:p>
@@ -858,7 +805,7 @@
           <w:color w:val="141413"/>
           <w:sz w:val="16"/>
         </w:rPr>
-        <w:t>Situation/Task: Enterprise reporting teams needed reusable warehouse model layers across 100+ transaction systems and inconsistent metric logic.</w:t>
+        <w:t>Situation/Task: A commercial-bank data middle-platform needed credit-domain maintenance, limit-system upgrade, core lending migration impact analysis, and reusable model layers across 100+ transaction systems.</w:t>
       </w:r>
     </w:p>
     <w:p>
@@ -873,7 +820,7 @@
           <w:color w:val="141413"/>
           <w:sz w:val="16"/>
         </w:rPr>
-        <w:t>Action: Architected 5-layer Hive warehouse models, integrated source data with Informatica PowerCenter, and built Impala/HQL metric logic plus UDF/UDTF processing.</w:t>
+        <w:t>Action: Led credit-domain delivery, maintained warehouse domains, integrated sources with Informatica PowerCenter, delivered SIT/UAT reports, optimized 30+ issue points, landed 15 key limit models, and tuned Impala skew, scripts, and UDF repricing-date logic.</w:t>
       </w:r>
     </w:p>
     <w:p>
@@ -888,7 +835,7 @@
           <w:color w:val="141413"/>
           <w:sz w:val="16"/>
         </w:rPr>
-        <w:t>Result: Improved cross-team model reuse by 50% and supported privacy-compliant analytics through sensitive-data masking and reusable computation logic.</w:t>
+        <w:t>Result: Improved cross-team model reuse by 50%, stabilized credit / limit / lending reporting, and supported bank-grade delivery through lineage, quality rules, controlled changes, and downstream marts.</w:t>
       </w:r>
     </w:p>
     <w:p>
@@ -922,7 +869,7 @@
           <w:color w:val="141413"/>
           <w:sz w:val="16"/>
         </w:rPr>
-        <w:t>Situation/Task: Commercial-bank marts needed stable definitions for corporate credit, limits, loan contracts, disbursement, repayment, settlement accounts, and product-level reporting.</w:t>
+        <w:t>Situation/Task: Commercial-bank marts needed stable definitions for corporate credit, limits, loan contracts, core lending, loan accounts, loan receipts, disbursement, repayment, settlement accounts, and product-level reporting.</w:t>
       </w:r>
     </w:p>
     <w:p>
@@ -937,7 +884,7 @@
           <w:color w:val="141413"/>
           <w:sz w:val="16"/>
         </w:rPr>
-        <w:t>Action: Maintained warehouse model-layer SQL, translated mart requirements into traceable logic, and aligned source lineage / issue handling with banking stakeholders.</w:t>
+        <w:t>Action: Maintained warehouse model-layer SQL, translated mart requirements into traceable logic, and aligned source lineage, model changes, issue handling, and reporting definitions with banking stakeholders.</w:t>
       </w:r>
     </w:p>
     <w:p>
@@ -952,7 +899,7 @@
           <w:color w:val="141413"/>
           <w:sz w:val="16"/>
         </w:rPr>
-        <w:t>Result: Supported financial, regulatory, and management reporting with bank-grade delivery discipline: consistent definitions, controlled changes, and stable downstream outputs.</w:t>
+        <w:t>Result: Supported financial, regulatory, and management reporting with bank-grade delivery discipline: consistent definitions, controlled changes, traceable issue handling, and stable downstream outputs.</w:t>
       </w:r>
     </w:p>
     <w:p>
@@ -1002,6 +949,77 @@
           <w:sz w:val="16"/>
         </w:rPr>
         <w:t>Action/Result: Troubleshot network/system issues and built Bash/Python automation scripts to reduce repetitive manual operations.</w:t>
+      </w:r>
+    </w:p>
+    <w:p>
+      <w:pPr>
+        <w:spacing w:before="80" w:after="40"/>
+        <w:pBdr>
+          <w:bottom w:val="single" w:sz="8" w:space="1" w:color="B45534"/>
+        </w:pBdr>
+      </w:pPr>
+      <w:r>
+        <w:rPr>
+          <w:b/>
+          <w:color w:val="1F374F"/>
+          <w:sz w:val="19"/>
+        </w:rPr>
+        <w:t>EDUCATION &amp; AIBA COURSEWORK</w:t>
+      </w:r>
+    </w:p>
+    <w:p>
+      <w:pPr>
+        <w:spacing w:after="0"/>
+      </w:pPr>
+      <w:r>
+        <w:rPr>
+          <w:b/>
+          <w:color w:val="141413"/>
+          <w:sz w:val="16"/>
+        </w:rPr>
+        <w:t>MSc in Artificial Intelligence and Business Analytics</w:t>
+      </w:r>
+      <w:r>
+        <w:rPr>
+          <w:color w:val="141413"/>
+          <w:sz w:val="16"/>
+        </w:rPr>
+        <w:t xml:space="preserve"> | Lingnan University, Hong Kong | 2025 - 2026</w:t>
+      </w:r>
+    </w:p>
+    <w:p>
+      <w:pPr>
+        <w:pStyle w:val="ListBullet"/>
+        <w:spacing w:after="8" w:line="245" w:lineRule="auto"/>
+        <w:ind w:left="259" w:hanging="173"/>
+      </w:pPr>
+      <w:r>
+        <w:rPr>
+          <w:rFonts w:ascii="Arial" w:hAnsi="Arial"/>
+          <w:color w:val="141413"/>
+          <w:sz w:val="16"/>
+        </w:rPr>
+        <w:t>Relevant coursework: AI foundations, business data management, analytics programming, blockchain, healthcare analytics, data visualization, generative AI programming, and AI-based optimization.</w:t>
+      </w:r>
+    </w:p>
+    <w:p>
+      <w:pPr>
+        <w:spacing w:after="0"/>
+      </w:pPr>
+      <w:r>
+        <w:rPr>
+          <w:b/>
+          <w:color w:val="141413"/>
+          <w:sz w:val="16"/>
+        </w:rPr>
+        <w:t>Bachelor of Management</w:t>
+      </w:r>
+      <w:r>
+        <w:rPr>
+          <w:color w:val="141413"/>
+          <w:sz w:val="16"/>
+        </w:rPr>
+        <w:t xml:space="preserve"> | Shenzhen University, China | 2014 - 2017</w:t>
       </w:r>
     </w:p>
     <w:p>

</xml_diff>